<commit_message>
Mejora de la programacion de la ESP32S3
</commit_message>
<xml_diff>
--- a/ESTACION_AQ_ACTUALIZADO.docx
+++ b/ESTACION_AQ_ACTUALIZADO.docx
@@ -1,6 +1,6 @@
 
 <file path=word/document.xml><?xml version="1.0" encoding="utf-8"?>
-<w:document xmlns:wpc="http://schemas.microsoft.com/office/word/2010/wordprocessingCanvas" xmlns:cx="http://schemas.microsoft.com/office/drawing/2014/chartex" xmlns:cx1="http://schemas.microsoft.com/office/drawing/2015/9/8/chartex" xmlns:cx2="http://schemas.microsoft.com/office/drawing/2015/10/21/chartex" xmlns:cx3="http://schemas.microsoft.com/office/drawing/2016/5/9/chartex" xmlns:cx4="http://schemas.microsoft.com/office/drawing/2016/5/10/chartex" xmlns:cx5="http://schemas.microsoft.com/office/drawing/2016/5/11/chartex" xmlns:cx6="http://schemas.microsoft.com/office/drawing/2016/5/12/chartex" xmlns:cx7="http://schemas.microsoft.com/office/drawing/2016/5/13/chartex" xmlns:cx8="http://schemas.microsoft.com/office/drawing/2016/5/14/chartex" xmlns:mc="http://schemas.openxmlformats.org/markup-compatibility/2006" xmlns:aink="http://schemas.microsoft.com/office/drawing/2016/ink" xmlns:am3d="http://schemas.microsoft.com/office/drawing/2017/model3d" xmlns:o="urn:schemas-microsoft-com:office:office" xmlns:oel="http://schemas.microsoft.com/office/2019/extlst" xmlns:r="http://schemas.openxmlformats.org/officeDocument/2006/relationships" xmlns:m="http://schemas.openxmlformats.org/officeDocument/2006/math" xmlns:v="urn:schemas-microsoft-com:vml" xmlns:wp14="http://schemas.microsoft.com/office/word/2010/wordprocessingDrawing" xmlns:wp="http://schemas.openxmlformats.org/drawingml/2006/wordprocessingDrawing" xmlns:w10="urn:schemas-microsoft-com:office:word" xmlns:w="http://schemas.openxmlformats.org/wordprocessingml/2006/main" xmlns:w14="http://schemas.microsoft.com/office/word/2010/wordml" xmlns:w15="http://schemas.microsoft.com/office/word/2012/wordml" xmlns:w16cex="http://schemas.microsoft.com/office/word/2018/wordml/cex" xmlns:w16cid="http://schemas.microsoft.com/office/word/2016/wordml/cid" xmlns:w16="http://schemas.microsoft.com/office/word/2018/wordml" xmlns:w16du="http://schemas.microsoft.com/office/word/2023/wordml/word16du" xmlns:w16sdtdh="http://schemas.microsoft.com/office/word/2020/wordml/sdtdatahash" xmlns:w16sdtfl="http://schemas.microsoft.com/office/word/2024/wordml/sdtformatlock" xmlns:w16se="http://schemas.microsoft.com/office/word/2015/wordml/symex" xmlns:wpg="http://schemas.microsoft.com/office/word/2010/wordprocessingGroup" xmlns:wpi="http://schemas.microsoft.com/office/word/2010/wordprocessingInk" xmlns:wne="http://schemas.microsoft.com/office/word/2006/wordml" xmlns:wps="http://schemas.microsoft.com/office/word/2010/wordprocessingShape" mc:Ignorable="w14 w15 w16se w16cid w16 w16cex w16sdtdh w16sdtfl w16du wp14">
+<w:document xmlns:wpc="http://schemas.microsoft.com/office/word/2010/wordprocessingCanvas" xmlns:cx="http://schemas.microsoft.com/office/drawing/2014/chartex" xmlns:cx1="http://schemas.microsoft.com/office/drawing/2015/9/8/chartex" xmlns:cx2="http://schemas.microsoft.com/office/drawing/2015/10/21/chartex" xmlns:cx3="http://schemas.microsoft.com/office/drawing/2016/5/9/chartex" xmlns:cx4="http://schemas.microsoft.com/office/drawing/2016/5/10/chartex" xmlns:cx5="http://schemas.microsoft.com/office/drawing/2016/5/11/chartex" xmlns:cx6="http://schemas.microsoft.com/office/drawing/2016/5/12/chartex" xmlns:cx7="http://schemas.microsoft.com/office/drawing/2016/5/13/chartex" xmlns:cx8="http://schemas.microsoft.com/office/drawing/2016/5/14/chartex" xmlns:mc="http://schemas.openxmlformats.org/markup-compatibility/2006" xmlns:aink="http://schemas.microsoft.com/office/drawing/2016/ink" xmlns:am3d="http://schemas.microsoft.com/office/drawing/2017/model3d" xmlns:o="urn:schemas-microsoft-com:office:office" xmlns:oel="http://schemas.microsoft.com/office/2019/extlst" xmlns:r="http://schemas.openxmlformats.org/officeDocument/2006/relationships" xmlns:m="http://schemas.openxmlformats.org/officeDocument/2006/math" xmlns:v="urn:schemas-microsoft-com:vml" xmlns:wp14="http://schemas.microsoft.com/office/word/2010/wordprocessingDrawing" xmlns:wp="http://schemas.openxmlformats.org/drawingml/2006/wordprocessingDrawing" xmlns:w10="urn:schemas-microsoft-com:office:word" xmlns:w="http://schemas.openxmlformats.org/wordprocessingml/2006/main" xmlns:w14="http://schemas.microsoft.com/office/word/2010/wordml" xmlns:w15="http://schemas.microsoft.com/office/word/2012/wordml" xmlns:w16cex="http://schemas.microsoft.com/office/word/2018/wordml/cex" xmlns:w16cid="http://schemas.microsoft.com/office/word/2016/wordml/cid" xmlns:w16="http://schemas.microsoft.com/office/word/2018/wordml" xmlns:w16sdtdh="http://schemas.microsoft.com/office/word/2020/wordml/sdtdatahash" xmlns:w16se="http://schemas.microsoft.com/office/word/2015/wordml/symex" xmlns:wpg="http://schemas.microsoft.com/office/word/2010/wordprocessingGroup" xmlns:wpi="http://schemas.microsoft.com/office/word/2010/wordprocessingInk" xmlns:wne="http://schemas.microsoft.com/office/word/2006/wordml" xmlns:wps="http://schemas.microsoft.com/office/word/2010/wordprocessingShape" mc:Ignorable="w14 w15 w16se w16cid w16 w16cex w16sdtdh wp14">
   <w:body>
     <w:p>
       <w:pPr>
@@ -2179,23 +2179,7 @@
                 <w:sz w:val="22"/>
                 <w:szCs w:val="22"/>
               </w:rPr>
-              <w:t>Buffer + MLR (</w:t>
-            </w:r>
-            <w:proofErr w:type="gramStart"/>
-            <w:r>
-              <w:rPr>
-                <w:sz w:val="22"/>
-                <w:szCs w:val="22"/>
-              </w:rPr>
-              <w:t>T,HR</w:t>
-            </w:r>
-            <w:proofErr w:type="gramEnd"/>
-            <w:r>
-              <w:rPr>
-                <w:sz w:val="22"/>
-                <w:szCs w:val="22"/>
-              </w:rPr>
-              <w:t>)</w:t>
+              <w:t>Buffer + MLR (T,HR)</w:t>
             </w:r>
           </w:p>
         </w:tc>
@@ -6867,7 +6851,7 @@
               </wp:anchor>
             </w:drawing>
           </mc:Choice>
-          <mc:Fallback>
+          <mc:Fallback xmlns:w16sdtfl="http://schemas.microsoft.com/office/word/2024/wordml/sdtformatlock" xmlns:w16du="http://schemas.microsoft.com/office/word/2023/wordml/word16du">
             <w:pict>
               <v:shapetype w14:anchorId="5B69DF8C" id="_x0000_t202" coordsize="21600,21600" o:spt="202" path="m,l,21600r21600,l21600,xe">
                 <v:stroke joinstyle="miter"/>
@@ -7043,7 +7027,7 @@
               </wp:anchor>
             </w:drawing>
           </mc:Choice>
-          <mc:Fallback>
+          <mc:Fallback xmlns:w16sdtfl="http://schemas.microsoft.com/office/word/2024/wordml/sdtformatlock" xmlns:w16du="http://schemas.microsoft.com/office/word/2023/wordml/word16du">
             <w:pict>
               <v:shape w14:anchorId="62C6565C" id="Cuadro de texto 5" o:spid="_x0000_s1027" type="#_x0000_t202" style="position:absolute;left:0;text-align:left;margin-left:233.35pt;margin-top:170.65pt;width:196.6pt;height:.05pt;z-index:251665408;visibility:visible;mso-wrap-style:square;mso-wrap-distance-left:9pt;mso-wrap-distance-top:0;mso-wrap-distance-right:9pt;mso-wrap-distance-bottom:0;mso-position-horizontal:absolute;mso-position-horizontal-relative:text;mso-position-vertical:absolute;mso-position-vertical-relative:text;v-text-anchor:top" o:gfxdata="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" stroked="f">
                 <v:textbox style="mso-fit-shape-to-text:t" inset="0,0,0,0">
@@ -7262,7 +7246,7 @@
               </wp:anchor>
             </w:drawing>
           </mc:Choice>
-          <mc:Fallback>
+          <mc:Fallback xmlns:w16sdtfl="http://schemas.microsoft.com/office/word/2024/wordml/sdtformatlock" xmlns:w16du="http://schemas.microsoft.com/office/word/2023/wordml/word16du">
             <w:pict>
               <v:shape w14:anchorId="01517300" id="Cuadro de texto 1" o:spid="_x0000_s1028" type="#_x0000_t202" style="position:absolute;left:0;text-align:left;margin-left:12.3pt;margin-top:173.8pt;width:196.6pt;height:.05pt;z-index:251661312;visibility:visible;mso-wrap-style:square;mso-wrap-distance-left:9pt;mso-wrap-distance-top:0;mso-wrap-distance-right:9pt;mso-wrap-distance-bottom:0;mso-position-horizontal:absolute;mso-position-horizontal-relative:text;mso-position-vertical:absolute;mso-position-vertical-relative:text;v-text-anchor:top" o:gfxdata="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" stroked="f">
                 <v:textbox style="mso-fit-shape-to-text:t" inset="0,0,0,0">
@@ -10358,7 +10342,7 @@
               </wp:anchor>
             </w:drawing>
           </mc:Choice>
-          <mc:Fallback>
+          <mc:Fallback xmlns:w16sdtfl="http://schemas.microsoft.com/office/word/2024/wordml/sdtformatlock" xmlns:w16du="http://schemas.microsoft.com/office/word/2023/wordml/word16du">
             <w:pict>
               <v:shape w14:anchorId="07263C34" id="Cuadro de texto 8" o:spid="_x0000_s1029" type="#_x0000_t202" style="position:absolute;margin-left:103.6pt;margin-top:172.95pt;width:229.35pt;height:.05pt;z-index:251671552;visibility:visible;mso-wrap-style:square;mso-width-percent:0;mso-wrap-distance-left:9pt;mso-wrap-distance-top:0;mso-wrap-distance-right:9pt;mso-wrap-distance-bottom:0;mso-position-horizontal:absolute;mso-position-horizontal-relative:text;mso-position-vertical:absolute;mso-position-vertical-relative:text;mso-width-percent:0;mso-width-relative:margin;v-text-anchor:top" o:gfxdata="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" stroked="f">
                 <v:textbox style="mso-fit-shape-to-text:t" inset="0,0,0,0">
@@ -10644,7 +10628,7 @@
               </wp:anchor>
             </w:drawing>
           </mc:Choice>
-          <mc:Fallback>
+          <mc:Fallback xmlns:w16sdtfl="http://schemas.microsoft.com/office/word/2024/wordml/sdtformatlock" xmlns:w16du="http://schemas.microsoft.com/office/word/2023/wordml/word16du">
             <w:pict>
               <v:shape w14:anchorId="276E7C3C" id="Cuadro de texto 9" o:spid="_x0000_s1030" type="#_x0000_t202" style="position:absolute;left:0;text-align:left;margin-left:64.7pt;margin-top:485.3pt;width:339.3pt;height:.05pt;z-index:251675648;visibility:visible;mso-wrap-style:square;mso-width-percent:0;mso-wrap-distance-left:9pt;mso-wrap-distance-top:0;mso-wrap-distance-right:9pt;mso-wrap-distance-bottom:0;mso-position-horizontal:absolute;mso-position-horizontal-relative:text;mso-position-vertical:absolute;mso-position-vertical-relative:text;mso-width-percent:0;mso-width-relative:margin;v-text-anchor:top" o:gfxdata="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" stroked="f">
                 <v:textbox style="mso-fit-shape-to-text:t" inset="0,0,0,0">
@@ -10720,7 +10704,7 @@
           <w:lang w:val="es-419"/>
         </w:rPr>
         <w:drawing>
-          <wp:anchor distT="0" distB="0" distL="114300" distR="114300" simplePos="0" relativeHeight="251673600" behindDoc="0" locked="0" layoutInCell="1" allowOverlap="1" wp14:anchorId="0A3E3E09" wp14:editId="783AAF72">
+          <wp:anchor distT="0" distB="0" distL="114300" distR="114300" simplePos="0" relativeHeight="251673600" behindDoc="0" locked="0" layoutInCell="1" allowOverlap="1" wp14:anchorId="0A3E3E09" wp14:editId="641AF222">
             <wp:simplePos x="0" y="0"/>
             <wp:positionH relativeFrom="margin">
               <wp:posOffset>1289050</wp:posOffset>
@@ -10928,7 +10912,7 @@
               </wp:anchor>
             </w:drawing>
           </mc:Choice>
-          <mc:Fallback>
+          <mc:Fallback xmlns:w16sdtfl="http://schemas.microsoft.com/office/word/2024/wordml/sdtformatlock" xmlns:w16du="http://schemas.microsoft.com/office/word/2023/wordml/word16du">
             <w:pict>
               <v:shape w14:anchorId="6289A000" id="Cuadro de texto 10" o:spid="_x0000_s1031" type="#_x0000_t202" style="position:absolute;left:0;text-align:left;margin-left:56.25pt;margin-top:589.25pt;width:373.15pt;height:.05pt;z-index:251678720;visibility:visible;mso-wrap-style:square;mso-wrap-distance-left:9pt;mso-wrap-distance-top:0;mso-wrap-distance-right:9pt;mso-wrap-distance-bottom:0;mso-position-horizontal:absolute;mso-position-horizontal-relative:text;mso-position-vertical:absolute;mso-position-vertical-relative:text;v-text-anchor:top" o:gfxdata="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" stroked="f">
                 <v:textbox style="mso-fit-shape-to-text:t" inset="0,0,0,0">
@@ -14266,23 +14250,7 @@
           <w:sz w:val="22"/>
           <w:szCs w:val="22"/>
         </w:rPr>
-        <w:t xml:space="preserve">-up de 4.7 </w:t>
-      </w:r>
-      <w:proofErr w:type="spellStart"/>
-      <w:r>
-        <w:rPr>
-          <w:sz w:val="22"/>
-          <w:szCs w:val="22"/>
-        </w:rPr>
-        <w:t>kΩ</w:t>
-      </w:r>
-      <w:proofErr w:type="spellEnd"/>
-      <w:r>
-        <w:rPr>
-          <w:sz w:val="22"/>
-          <w:szCs w:val="22"/>
-        </w:rPr>
-        <w:t xml:space="preserve"> hacia 3.3 V </w:t>
+        <w:t xml:space="preserve">-up de 4.7 kΩ hacia 3.3 V </w:t>
       </w:r>
       <w:r>
         <w:rPr>
@@ -15428,7 +15396,7 @@
         </w:rPr>
         <w:lastRenderedPageBreak/>
         <w:drawing>
-          <wp:anchor distT="0" distB="0" distL="114300" distR="114300" simplePos="0" relativeHeight="251685888" behindDoc="0" locked="0" layoutInCell="1" allowOverlap="1" wp14:anchorId="765C22A6" wp14:editId="055A6754">
+          <wp:anchor distT="0" distB="0" distL="114300" distR="114300" simplePos="0" relativeHeight="251685888" behindDoc="0" locked="0" layoutInCell="1" allowOverlap="1" wp14:anchorId="765C22A6" wp14:editId="0A7FCE53">
             <wp:simplePos x="0" y="0"/>
             <wp:positionH relativeFrom="margin">
               <wp:align>right</wp:align>
@@ -15604,7 +15572,7 @@
               </wp:anchor>
             </w:drawing>
           </mc:Choice>
-          <mc:Fallback>
+          <mc:Fallback xmlns:w16sdtfl="http://schemas.microsoft.com/office/word/2024/wordml/sdtformatlock" xmlns:w16du="http://schemas.microsoft.com/office/word/2023/wordml/word16du">
             <w:pict>
               <v:shape w14:anchorId="086CC318" id="Cuadro de texto 11" o:spid="_x0000_s1032" type="#_x0000_t202" style="position:absolute;left:0;text-align:left;margin-left:29.85pt;margin-top:.7pt;width:396.4pt;height:.05pt;z-index:251681792;visibility:visible;mso-wrap-style:square;mso-wrap-distance-left:9pt;mso-wrap-distance-top:0;mso-wrap-distance-right:9pt;mso-wrap-distance-bottom:0;mso-position-horizontal:absolute;mso-position-horizontal-relative:text;mso-position-vertical:absolute;mso-position-vertical-relative:text;v-text-anchor:top" o:gfxdata="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" stroked="f">
                 <v:textbox style="mso-fit-shape-to-text:t" inset="0,0,0,0">
@@ -16043,6 +16011,7 @@
       </w:pPr>
       <w:r>
         <w:rPr>
+          <w:noProof/>
           <w:sz w:val="22"/>
           <w:szCs w:val="22"/>
         </w:rPr>
@@ -16384,7 +16353,7 @@
               </wp:anchor>
             </w:drawing>
           </mc:Choice>
-          <mc:Fallback>
+          <mc:Fallback xmlns:w16sdtfl="http://schemas.microsoft.com/office/word/2024/wordml/sdtformatlock" xmlns:w16du="http://schemas.microsoft.com/office/word/2023/wordml/word16du">
             <w:pict>
               <v:shapetype w14:anchorId="11EF21F9" id="_x0000_t202" coordsize="21600,21600" o:spt="202" path="m,l,21600r21600,l21600,xe">
                 <v:stroke joinstyle="miter"/>
@@ -16519,7 +16488,6 @@
         <w:t xml:space="preserve">) mediante su ADC interno de 12 bits en el pin GPIO1. La resolución del ADC proporciona 4096 niveles de cuantización en el rango de 0 a 3.3 V. El firmware realiza la lectura mediante la función </w:t>
       </w:r>
       <w:proofErr w:type="spellStart"/>
-      <w:proofErr w:type="gramStart"/>
       <w:r>
         <w:rPr>
           <w:sz w:val="22"/>
@@ -16533,15 +16501,7 @@
           <w:sz w:val="22"/>
           <w:szCs w:val="22"/>
         </w:rPr>
-        <w:t>(</w:t>
-      </w:r>
-      <w:proofErr w:type="gramEnd"/>
-      <w:r>
-        <w:rPr>
-          <w:sz w:val="22"/>
-          <w:szCs w:val="22"/>
-        </w:rPr>
-        <w:t xml:space="preserve">) en cada ciclo del </w:t>
+        <w:t xml:space="preserve">() en cada ciclo del </w:t>
       </w:r>
       <w:proofErr w:type="spellStart"/>
       <w:r>
@@ -16798,21 +16758,66 @@
       </w:pPr>
       <w:r>
         <w:rPr>
+          <w:sz w:val="22"/>
+          <w:szCs w:val="22"/>
+        </w:rPr>
+        <w:t>El intercambio de información se realiza mediante mensajes JSON debido a su simplicidad, compatibilidad y bajo consumo de ancho de banda</w:t>
+      </w:r>
+      <w:r>
+        <w:rPr>
+          <w:sz w:val="22"/>
+          <w:szCs w:val="22"/>
+        </w:rPr>
+        <w:t>, la ESP32 envía un mensaje de</w:t>
+      </w:r>
+      <w:r>
+        <w:rPr>
+          <w:sz w:val="22"/>
+          <w:szCs w:val="22"/>
+        </w:rPr>
+        <w:t xml:space="preserve"> “</w:t>
+      </w:r>
+      <w:r>
+        <w:rPr>
+          <w:sz w:val="22"/>
+          <w:szCs w:val="22"/>
+        </w:rPr>
+        <w:t>CO:40.37,NO2:13.159,CO2:415.0,VOC:0.0,EST:ALARMA</w:t>
+      </w:r>
+      <w:r>
+        <w:rPr>
+          <w:sz w:val="22"/>
+          <w:szCs w:val="22"/>
+        </w:rPr>
+        <w:t>”, pero lo empaqueta de la siguiente manera.</w:t>
+      </w:r>
+    </w:p>
+    <w:p>
+      <w:pPr>
+        <w:spacing w:before="80" w:after="80"/>
+        <w:jc w:val="both"/>
+        <w:rPr>
+          <w:sz w:val="22"/>
+          <w:szCs w:val="22"/>
+        </w:rPr>
+      </w:pPr>
+      <w:r>
+        <w:rPr>
           <w:noProof/>
           <w:sz w:val="22"/>
           <w:szCs w:val="22"/>
         </w:rPr>
         <w:drawing>
-          <wp:anchor distT="0" distB="0" distL="114300" distR="114300" simplePos="0" relativeHeight="251686912" behindDoc="0" locked="0" layoutInCell="1" allowOverlap="1" wp14:anchorId="352E1B6F" wp14:editId="3B333E0D">
+          <wp:anchor distT="0" distB="0" distL="114300" distR="114300" simplePos="0" relativeHeight="251686912" behindDoc="0" locked="0" layoutInCell="1" allowOverlap="1" wp14:anchorId="352E1B6F" wp14:editId="4907AB2B">
             <wp:simplePos x="0" y="0"/>
-            <wp:positionH relativeFrom="column">
-              <wp:posOffset>1189202</wp:posOffset>
+            <wp:positionH relativeFrom="margin">
+              <wp:align>center</wp:align>
             </wp:positionH>
             <wp:positionV relativeFrom="paragraph">
-              <wp:posOffset>803783</wp:posOffset>
+              <wp:posOffset>255524</wp:posOffset>
             </wp:positionV>
-            <wp:extent cx="3474720" cy="1225493"/>
-            <wp:effectExtent l="0" t="0" r="0" b="0"/>
+            <wp:extent cx="4791075" cy="1689735"/>
+            <wp:effectExtent l="0" t="0" r="9525" b="5715"/>
             <wp:wrapTopAndBottom/>
             <wp:docPr id="2" name="Imagen 2"/>
             <wp:cNvGraphicFramePr>
@@ -16840,7 +16845,7 @@
                   <pic:spPr>
                     <a:xfrm>
                       <a:off x="0" y="0"/>
-                      <a:ext cx="3474720" cy="1225493"/>
+                      <a:ext cx="4791075" cy="1689735"/>
                     </a:xfrm>
                     <a:prstGeom prst="rect">
                       <a:avLst/>
@@ -16849,107 +16854,14 @@
                 </pic:pic>
               </a:graphicData>
             </a:graphic>
+            <wp14:sizeRelH relativeFrom="margin">
+              <wp14:pctWidth>0</wp14:pctWidth>
+            </wp14:sizeRelH>
+            <wp14:sizeRelV relativeFrom="margin">
+              <wp14:pctHeight>0</wp14:pctHeight>
+            </wp14:sizeRelV>
           </wp:anchor>
         </w:drawing>
-      </w:r>
-      <w:r>
-        <w:rPr>
-          <w:sz w:val="22"/>
-          <w:szCs w:val="22"/>
-        </w:rPr>
-        <w:t>El intercambio de información se realiza mediante mensajes JSON debido a su simplicidad, compatibilidad y bajo consumo de ancho de banda</w:t>
-      </w:r>
-      <w:r>
-        <w:rPr>
-          <w:sz w:val="22"/>
-          <w:szCs w:val="22"/>
-        </w:rPr>
-        <w:t>, la ESP32 envía un mensaje de</w:t>
-      </w:r>
-      <w:r>
-        <w:rPr>
-          <w:sz w:val="22"/>
-          <w:szCs w:val="22"/>
-        </w:rPr>
-        <w:t xml:space="preserve"> “</w:t>
-      </w:r>
-      <w:r>
-        <w:rPr>
-          <w:sz w:val="22"/>
-          <w:szCs w:val="22"/>
-        </w:rPr>
-        <w:t>CO:40.</w:t>
-      </w:r>
-      <w:proofErr w:type="gramStart"/>
-      <w:r>
-        <w:rPr>
-          <w:sz w:val="22"/>
-          <w:szCs w:val="22"/>
-        </w:rPr>
-        <w:t>37,NO</w:t>
-      </w:r>
-      <w:proofErr w:type="gramEnd"/>
-      <w:r>
-        <w:rPr>
-          <w:sz w:val="22"/>
-          <w:szCs w:val="22"/>
-        </w:rPr>
-        <w:t>2:13.</w:t>
-      </w:r>
-      <w:proofErr w:type="gramStart"/>
-      <w:r>
-        <w:rPr>
-          <w:sz w:val="22"/>
-          <w:szCs w:val="22"/>
-        </w:rPr>
-        <w:t>159,CO2</w:t>
-      </w:r>
-      <w:proofErr w:type="gramEnd"/>
-      <w:r>
-        <w:rPr>
-          <w:sz w:val="22"/>
-          <w:szCs w:val="22"/>
-        </w:rPr>
-        <w:t>:415.</w:t>
-      </w:r>
-      <w:proofErr w:type="gramStart"/>
-      <w:r>
-        <w:rPr>
-          <w:sz w:val="22"/>
-          <w:szCs w:val="22"/>
-        </w:rPr>
-        <w:t>0,VOC</w:t>
-      </w:r>
-      <w:proofErr w:type="gramEnd"/>
-      <w:r>
-        <w:rPr>
-          <w:sz w:val="22"/>
-          <w:szCs w:val="22"/>
-        </w:rPr>
-        <w:t>:0.</w:t>
-      </w:r>
-      <w:proofErr w:type="gramStart"/>
-      <w:r>
-        <w:rPr>
-          <w:sz w:val="22"/>
-          <w:szCs w:val="22"/>
-        </w:rPr>
-        <w:t>0,EST</w:t>
-      </w:r>
-      <w:proofErr w:type="gramEnd"/>
-      <w:r>
-        <w:rPr>
-          <w:sz w:val="22"/>
-          <w:szCs w:val="22"/>
-        </w:rPr>
-        <w:t>:ALARMA</w:t>
-      </w:r>
-      <w:r>
-        <w:rPr>
-          <w:sz w:val="22"/>
-          <w:szCs w:val="22"/>
-        </w:rPr>
-        <w:t>”, pero lo empaqueta de la siguiente manera.</w:t>
       </w:r>
     </w:p>
     <w:p>
@@ -16961,6 +16873,64 @@
           <w:szCs w:val="22"/>
         </w:rPr>
       </w:pPr>
+    </w:p>
+    <w:p>
+      <w:pPr>
+        <w:spacing w:before="80" w:after="80"/>
+        <w:jc w:val="both"/>
+        <w:rPr>
+          <w:sz w:val="22"/>
+          <w:szCs w:val="22"/>
+        </w:rPr>
+      </w:pPr>
+    </w:p>
+    <w:p>
+      <w:pPr>
+        <w:spacing w:before="80" w:after="80"/>
+        <w:jc w:val="both"/>
+        <w:rPr>
+          <w:sz w:val="22"/>
+          <w:szCs w:val="22"/>
+        </w:rPr>
+      </w:pPr>
+    </w:p>
+    <w:p>
+      <w:pPr>
+        <w:spacing w:before="80" w:after="80"/>
+        <w:jc w:val="both"/>
+        <w:rPr>
+          <w:sz w:val="22"/>
+          <w:szCs w:val="22"/>
+        </w:rPr>
+      </w:pPr>
+    </w:p>
+    <w:p>
+      <w:pPr>
+        <w:spacing w:before="80" w:after="80"/>
+        <w:jc w:val="both"/>
+        <w:rPr>
+          <w:sz w:val="22"/>
+          <w:szCs w:val="22"/>
+        </w:rPr>
+      </w:pPr>
+      <w:r>
+        <w:rPr>
+          <w:sz w:val="22"/>
+          <w:szCs w:val="22"/>
+        </w:rPr>
+        <w:lastRenderedPageBreak/>
+        <w:t>El cual se vería como el siguiente ejemplo:</w:t>
+      </w:r>
+    </w:p>
+    <w:p>
+      <w:pPr>
+        <w:spacing w:before="80" w:after="80"/>
+        <w:jc w:val="both"/>
+        <w:rPr>
+          <w:sz w:val="22"/>
+          <w:szCs w:val="22"/>
+        </w:rPr>
+      </w:pPr>
       <w:r>
         <w:rPr>
           <w:noProof/>
@@ -16968,13 +16938,13 @@
           <w:szCs w:val="22"/>
         </w:rPr>
         <w:drawing>
-          <wp:anchor distT="0" distB="0" distL="114300" distR="114300" simplePos="0" relativeHeight="251687936" behindDoc="0" locked="0" layoutInCell="1" allowOverlap="1" wp14:anchorId="637B248C" wp14:editId="4BF63196">
+          <wp:anchor distT="0" distB="0" distL="114300" distR="114300" simplePos="0" relativeHeight="251687936" behindDoc="0" locked="0" layoutInCell="1" allowOverlap="1" wp14:anchorId="637B248C" wp14:editId="20207998">
             <wp:simplePos x="0" y="0"/>
             <wp:positionH relativeFrom="column">
-              <wp:posOffset>1759788</wp:posOffset>
+              <wp:posOffset>1919783</wp:posOffset>
             </wp:positionH>
             <wp:positionV relativeFrom="paragraph">
-              <wp:posOffset>248590</wp:posOffset>
+              <wp:posOffset>170129</wp:posOffset>
             </wp:positionV>
             <wp:extent cx="2057687" cy="1619476"/>
             <wp:effectExtent l="0" t="0" r="0" b="0"/>
@@ -17017,12 +16987,23 @@
           </wp:anchor>
         </w:drawing>
       </w:r>
-      <w:r>
-        <w:rPr>
-          <w:sz w:val="22"/>
-          <w:szCs w:val="22"/>
-        </w:rPr>
-        <w:t>El cual se vería como el siguiente ejemplo:</w:t>
+    </w:p>
+    <w:p>
+      <w:pPr>
+        <w:pStyle w:val="Ttulo1"/>
+        <w:rPr>
+          <w:color w:val="auto"/>
+          <w:sz w:val="22"/>
+          <w:szCs w:val="22"/>
+        </w:rPr>
+      </w:pPr>
+      <w:r>
+        <w:rPr>
+          <w:color w:val="auto"/>
+          <w:sz w:val="22"/>
+          <w:szCs w:val="22"/>
+        </w:rPr>
+        <w:t>REFERENCIAS BIBLIOGRÁFICAS</w:t>
       </w:r>
     </w:p>
     <w:p>
@@ -17032,43 +17013,14 @@
         <w:rPr>
           <w:sz w:val="22"/>
           <w:szCs w:val="22"/>
+          <w:lang w:val="en-AU"/>
         </w:rPr>
       </w:pPr>
-    </w:p>
-    <w:p>
-      <w:pPr>
-        <w:pStyle w:val="Ttulo1"/>
-        <w:rPr>
-          <w:color w:val="auto"/>
-          <w:sz w:val="22"/>
-          <w:szCs w:val="22"/>
-        </w:rPr>
-      </w:pPr>
-      <w:r>
-        <w:rPr>
-          <w:color w:val="auto"/>
-          <w:sz w:val="22"/>
-          <w:szCs w:val="22"/>
-        </w:rPr>
-        <w:t>REFERENCIAS BIBLIOGRÁFICAS</w:t>
-      </w:r>
-    </w:p>
-    <w:p>
-      <w:pPr>
-        <w:spacing w:before="80" w:after="80"/>
-        <w:jc w:val="both"/>
-        <w:rPr>
-          <w:sz w:val="22"/>
-          <w:szCs w:val="22"/>
-          <w:lang w:val="en-AU"/>
-        </w:rPr>
-      </w:pPr>
-      <w:r>
-        <w:rPr>
-          <w:sz w:val="22"/>
-          <w:szCs w:val="22"/>
-        </w:rPr>
-        <w:lastRenderedPageBreak/>
+      <w:r>
+        <w:rPr>
+          <w:sz w:val="22"/>
+          <w:szCs w:val="22"/>
+        </w:rPr>
         <w:t xml:space="preserve">Borrego, C., Costa, A. M., Ginja, J., Amorim, M., Coutinho, M., Karatzas, K., ... </w:t>
       </w:r>
       <w:r>
@@ -17609,6 +17561,7 @@
           <w:szCs w:val="22"/>
           <w:lang w:val="en-AU"/>
         </w:rPr>
+        <w:lastRenderedPageBreak/>
         <w:t>ESP32-S3 Technical Reference Manual: https://documentation.espressif.com/esp32-s3_technical_reference_manual_en.pdf</w:t>
       </w:r>
     </w:p>
@@ -17758,7 +17711,25 @@
           <w:sz w:val="22"/>
           <w:szCs w:val="22"/>
         </w:rPr>
-        <w:t xml:space="preserve">A2. BOM Actualizada (Lista de Materiales v1 — Pedido Mouser </w:t>
+        <w:t xml:space="preserve">A2. BOM Actualizada (Lista de Materiales v1 — Pedido </w:t>
+      </w:r>
+      <w:proofErr w:type="spellStart"/>
+      <w:r>
+        <w:rPr>
+          <w:color w:val="auto"/>
+          <w:sz w:val="22"/>
+          <w:szCs w:val="22"/>
+        </w:rPr>
+        <w:t>Mouser</w:t>
+      </w:r>
+      <w:proofErr w:type="spellEnd"/>
+      <w:r>
+        <w:rPr>
+          <w:color w:val="auto"/>
+          <w:sz w:val="22"/>
+          <w:szCs w:val="22"/>
+        </w:rPr>
+        <w:t xml:space="preserve"> </w:t>
       </w:r>
       <w:proofErr w:type="spellStart"/>
       <w:r>
@@ -17793,7 +17764,23 @@
           <w:sz w:val="22"/>
           <w:szCs w:val="22"/>
         </w:rPr>
-        <w:t xml:space="preserve">La siguiente tabla refleja los componentes efectivamente adquiridos según la orden de compra Mouser </w:t>
+        <w:t xml:space="preserve">La siguiente tabla refleja los componentes efectivamente adquiridos según la orden de compra </w:t>
+      </w:r>
+      <w:proofErr w:type="spellStart"/>
+      <w:r>
+        <w:rPr>
+          <w:sz w:val="22"/>
+          <w:szCs w:val="22"/>
+        </w:rPr>
+        <w:t>Mouser</w:t>
+      </w:r>
+      <w:proofErr w:type="spellEnd"/>
+      <w:r>
+        <w:rPr>
+          <w:sz w:val="22"/>
+          <w:szCs w:val="22"/>
+        </w:rPr>
+        <w:t xml:space="preserve"> </w:t>
       </w:r>
       <w:proofErr w:type="spellStart"/>
       <w:r>
@@ -17886,7 +17873,6 @@
                 <w:sz w:val="22"/>
                 <w:szCs w:val="22"/>
               </w:rPr>
-              <w:lastRenderedPageBreak/>
               <w:t>Ítem</w:t>
             </w:r>
           </w:p>
@@ -19639,6 +19625,7 @@
                 <w:sz w:val="22"/>
                 <w:szCs w:val="22"/>
               </w:rPr>
+              <w:lastRenderedPageBreak/>
               <w:t>15</w:t>
             </w:r>
           </w:p>
@@ -20437,15 +20424,7 @@
                 <w:sz w:val="22"/>
                 <w:szCs w:val="22"/>
               </w:rPr>
-              <w:t xml:space="preserve">Resistor película fina </w:t>
-            </w:r>
-            <w:r>
-              <w:rPr>
-                <w:sz w:val="22"/>
-                <w:szCs w:val="22"/>
-              </w:rPr>
-              <w:lastRenderedPageBreak/>
-              <w:t>4.7 kΩ, 0.1%, 1/8W, 0805</w:t>
+              <w:t>Resistor película fina 4.7 kΩ, 0.1%, 1/8W, 0805</w:t>
             </w:r>
           </w:p>
         </w:tc>
@@ -20478,7 +20457,6 @@
                 <w:sz w:val="22"/>
                 <w:szCs w:val="22"/>
               </w:rPr>
-              <w:lastRenderedPageBreak/>
               <w:t>10</w:t>
             </w:r>
           </w:p>
@@ -22051,6 +22029,7 @@
                 <w:sz w:val="22"/>
                 <w:szCs w:val="22"/>
               </w:rPr>
+              <w:lastRenderedPageBreak/>
               <w:t>26</w:t>
             </w:r>
           </w:p>
@@ -22560,7 +22539,7 @@
 </file>
 
 <file path=word/endnotes.xml><?xml version="1.0" encoding="utf-8"?>
-<w:endnotes xmlns:wpc="http://schemas.microsoft.com/office/word/2010/wordprocessingCanvas" xmlns:cx="http://schemas.microsoft.com/office/drawing/2014/chartex" xmlns:cx1="http://schemas.microsoft.com/office/drawing/2015/9/8/chartex" xmlns:cx2="http://schemas.microsoft.com/office/drawing/2015/10/21/chartex" xmlns:cx3="http://schemas.microsoft.com/office/drawing/2016/5/9/chartex" xmlns:cx4="http://schemas.microsoft.com/office/drawing/2016/5/10/chartex" xmlns:cx5="http://schemas.microsoft.com/office/drawing/2016/5/11/chartex" xmlns:cx6="http://schemas.microsoft.com/office/drawing/2016/5/12/chartex" xmlns:cx7="http://schemas.microsoft.com/office/drawing/2016/5/13/chartex" xmlns:cx8="http://schemas.microsoft.com/office/drawing/2016/5/14/chartex" xmlns:mc="http://schemas.openxmlformats.org/markup-compatibility/2006" xmlns:aink="http://schemas.microsoft.com/office/drawing/2016/ink" xmlns:am3d="http://schemas.microsoft.com/office/drawing/2017/model3d" xmlns:o="urn:schemas-microsoft-com:office:office" xmlns:oel="http://schemas.microsoft.com/office/2019/extlst" xmlns:r="http://schemas.openxmlformats.org/officeDocument/2006/relationships" xmlns:m="http://schemas.openxmlformats.org/officeDocument/2006/math" xmlns:v="urn:schemas-microsoft-com:vml" xmlns:wp14="http://schemas.microsoft.com/office/word/2010/wordprocessingDrawing" xmlns:wp="http://schemas.openxmlformats.org/drawingml/2006/wordprocessingDrawing" xmlns:w10="urn:schemas-microsoft-com:office:word" xmlns:w="http://schemas.openxmlformats.org/wordprocessingml/2006/main" xmlns:w14="http://schemas.microsoft.com/office/word/2010/wordml" xmlns:w15="http://schemas.microsoft.com/office/word/2012/wordml" xmlns:w16cex="http://schemas.microsoft.com/office/word/2018/wordml/cex" xmlns:w16cid="http://schemas.microsoft.com/office/word/2016/wordml/cid" xmlns:w16="http://schemas.microsoft.com/office/word/2018/wordml" xmlns:w16du="http://schemas.microsoft.com/office/word/2023/wordml/word16du" xmlns:w16sdtdh="http://schemas.microsoft.com/office/word/2020/wordml/sdtdatahash" xmlns:w16sdtfl="http://schemas.microsoft.com/office/word/2024/wordml/sdtformatlock" xmlns:w16se="http://schemas.microsoft.com/office/word/2015/wordml/symex" xmlns:wpg="http://schemas.microsoft.com/office/word/2010/wordprocessingGroup" xmlns:wpi="http://schemas.microsoft.com/office/word/2010/wordprocessingInk" xmlns:wne="http://schemas.microsoft.com/office/word/2006/wordml" xmlns:wps="http://schemas.microsoft.com/office/word/2010/wordprocessingShape" mc:Ignorable="w14 w15 w16se w16cid w16 w16cex w16sdtdh w16sdtfl w16du wp14">
+<w:endnotes xmlns:wpc="http://schemas.microsoft.com/office/word/2010/wordprocessingCanvas" xmlns:cx="http://schemas.microsoft.com/office/drawing/2014/chartex" xmlns:cx1="http://schemas.microsoft.com/office/drawing/2015/9/8/chartex" xmlns:cx2="http://schemas.microsoft.com/office/drawing/2015/10/21/chartex" xmlns:cx3="http://schemas.microsoft.com/office/drawing/2016/5/9/chartex" xmlns:cx4="http://schemas.microsoft.com/office/drawing/2016/5/10/chartex" xmlns:cx5="http://schemas.microsoft.com/office/drawing/2016/5/11/chartex" xmlns:cx6="http://schemas.microsoft.com/office/drawing/2016/5/12/chartex" xmlns:cx7="http://schemas.microsoft.com/office/drawing/2016/5/13/chartex" xmlns:cx8="http://schemas.microsoft.com/office/drawing/2016/5/14/chartex" xmlns:mc="http://schemas.openxmlformats.org/markup-compatibility/2006" xmlns:aink="http://schemas.microsoft.com/office/drawing/2016/ink" xmlns:am3d="http://schemas.microsoft.com/office/drawing/2017/model3d" xmlns:o="urn:schemas-microsoft-com:office:office" xmlns:oel="http://schemas.microsoft.com/office/2019/extlst" xmlns:r="http://schemas.openxmlformats.org/officeDocument/2006/relationships" xmlns:m="http://schemas.openxmlformats.org/officeDocument/2006/math" xmlns:v="urn:schemas-microsoft-com:vml" xmlns:wp14="http://schemas.microsoft.com/office/word/2010/wordprocessingDrawing" xmlns:wp="http://schemas.openxmlformats.org/drawingml/2006/wordprocessingDrawing" xmlns:w10="urn:schemas-microsoft-com:office:word" xmlns:w="http://schemas.openxmlformats.org/wordprocessingml/2006/main" xmlns:w14="http://schemas.microsoft.com/office/word/2010/wordml" xmlns:w15="http://schemas.microsoft.com/office/word/2012/wordml" xmlns:w16cex="http://schemas.microsoft.com/office/word/2018/wordml/cex" xmlns:w16cid="http://schemas.microsoft.com/office/word/2016/wordml/cid" xmlns:w16="http://schemas.microsoft.com/office/word/2018/wordml" xmlns:w16sdtdh="http://schemas.microsoft.com/office/word/2020/wordml/sdtdatahash" xmlns:w16se="http://schemas.microsoft.com/office/word/2015/wordml/symex" xmlns:wpg="http://schemas.microsoft.com/office/word/2010/wordprocessingGroup" xmlns:wpi="http://schemas.microsoft.com/office/word/2010/wordprocessingInk" xmlns:wne="http://schemas.microsoft.com/office/word/2006/wordml" xmlns:wps="http://schemas.microsoft.com/office/word/2010/wordprocessingShape" mc:Ignorable="w14 w15 w16se w16cid w16 w16cex w16sdtdh wp14">
   <w:endnote w:type="separator" w:id="-1">
     <w:p>
       <w:r>
@@ -22579,7 +22558,7 @@
 </file>
 
 <file path=word/footnotes.xml><?xml version="1.0" encoding="utf-8"?>
-<w:footnotes xmlns:wpc="http://schemas.microsoft.com/office/word/2010/wordprocessingCanvas" xmlns:cx="http://schemas.microsoft.com/office/drawing/2014/chartex" xmlns:cx1="http://schemas.microsoft.com/office/drawing/2015/9/8/chartex" xmlns:cx2="http://schemas.microsoft.com/office/drawing/2015/10/21/chartex" xmlns:cx3="http://schemas.microsoft.com/office/drawing/2016/5/9/chartex" xmlns:cx4="http://schemas.microsoft.com/office/drawing/2016/5/10/chartex" xmlns:cx5="http://schemas.microsoft.com/office/drawing/2016/5/11/chartex" xmlns:cx6="http://schemas.microsoft.com/office/drawing/2016/5/12/chartex" xmlns:cx7="http://schemas.microsoft.com/office/drawing/2016/5/13/chartex" xmlns:cx8="http://schemas.microsoft.com/office/drawing/2016/5/14/chartex" xmlns:mc="http://schemas.openxmlformats.org/markup-compatibility/2006" xmlns:aink="http://schemas.microsoft.com/office/drawing/2016/ink" xmlns:am3d="http://schemas.microsoft.com/office/drawing/2017/model3d" xmlns:o="urn:schemas-microsoft-com:office:office" xmlns:oel="http://schemas.microsoft.com/office/2019/extlst" xmlns:r="http://schemas.openxmlformats.org/officeDocument/2006/relationships" xmlns:m="http://schemas.openxmlformats.org/officeDocument/2006/math" xmlns:v="urn:schemas-microsoft-com:vml" xmlns:wp14="http://schemas.microsoft.com/office/word/2010/wordprocessingDrawing" xmlns:wp="http://schemas.openxmlformats.org/drawingml/2006/wordprocessingDrawing" xmlns:w10="urn:schemas-microsoft-com:office:word" xmlns:w="http://schemas.openxmlformats.org/wordprocessingml/2006/main" xmlns:w14="http://schemas.microsoft.com/office/word/2010/wordml" xmlns:w15="http://schemas.microsoft.com/office/word/2012/wordml" xmlns:w16cex="http://schemas.microsoft.com/office/word/2018/wordml/cex" xmlns:w16cid="http://schemas.microsoft.com/office/word/2016/wordml/cid" xmlns:w16="http://schemas.microsoft.com/office/word/2018/wordml" xmlns:w16du="http://schemas.microsoft.com/office/word/2023/wordml/word16du" xmlns:w16sdtdh="http://schemas.microsoft.com/office/word/2020/wordml/sdtdatahash" xmlns:w16sdtfl="http://schemas.microsoft.com/office/word/2024/wordml/sdtformatlock" xmlns:w16se="http://schemas.microsoft.com/office/word/2015/wordml/symex" xmlns:wpg="http://schemas.microsoft.com/office/word/2010/wordprocessingGroup" xmlns:wpi="http://schemas.microsoft.com/office/word/2010/wordprocessingInk" xmlns:wne="http://schemas.microsoft.com/office/word/2006/wordml" xmlns:wps="http://schemas.microsoft.com/office/word/2010/wordprocessingShape" mc:Ignorable="w14 w15 w16se w16cid w16 w16cex w16sdtdh w16sdtfl w16du wp14">
+<w:footnotes xmlns:wpc="http://schemas.microsoft.com/office/word/2010/wordprocessingCanvas" xmlns:cx="http://schemas.microsoft.com/office/drawing/2014/chartex" xmlns:cx1="http://schemas.microsoft.com/office/drawing/2015/9/8/chartex" xmlns:cx2="http://schemas.microsoft.com/office/drawing/2015/10/21/chartex" xmlns:cx3="http://schemas.microsoft.com/office/drawing/2016/5/9/chartex" xmlns:cx4="http://schemas.microsoft.com/office/drawing/2016/5/10/chartex" xmlns:cx5="http://schemas.microsoft.com/office/drawing/2016/5/11/chartex" xmlns:cx6="http://schemas.microsoft.com/office/drawing/2016/5/12/chartex" xmlns:cx7="http://schemas.microsoft.com/office/drawing/2016/5/13/chartex" xmlns:cx8="http://schemas.microsoft.com/office/drawing/2016/5/14/chartex" xmlns:mc="http://schemas.openxmlformats.org/markup-compatibility/2006" xmlns:aink="http://schemas.microsoft.com/office/drawing/2016/ink" xmlns:am3d="http://schemas.microsoft.com/office/drawing/2017/model3d" xmlns:o="urn:schemas-microsoft-com:office:office" xmlns:oel="http://schemas.microsoft.com/office/2019/extlst" xmlns:r="http://schemas.openxmlformats.org/officeDocument/2006/relationships" xmlns:m="http://schemas.openxmlformats.org/officeDocument/2006/math" xmlns:v="urn:schemas-microsoft-com:vml" xmlns:wp14="http://schemas.microsoft.com/office/word/2010/wordprocessingDrawing" xmlns:wp="http://schemas.openxmlformats.org/drawingml/2006/wordprocessingDrawing" xmlns:w10="urn:schemas-microsoft-com:office:word" xmlns:w="http://schemas.openxmlformats.org/wordprocessingml/2006/main" xmlns:w14="http://schemas.microsoft.com/office/word/2010/wordml" xmlns:w15="http://schemas.microsoft.com/office/word/2012/wordml" xmlns:w16cex="http://schemas.microsoft.com/office/word/2018/wordml/cex" xmlns:w16cid="http://schemas.microsoft.com/office/word/2016/wordml/cid" xmlns:w16="http://schemas.microsoft.com/office/word/2018/wordml" xmlns:w16sdtdh="http://schemas.microsoft.com/office/word/2020/wordml/sdtdatahash" xmlns:w16se="http://schemas.microsoft.com/office/word/2015/wordml/symex" xmlns:wpg="http://schemas.microsoft.com/office/word/2010/wordprocessingGroup" xmlns:wpi="http://schemas.microsoft.com/office/word/2010/wordprocessingInk" xmlns:wne="http://schemas.microsoft.com/office/word/2006/wordml" xmlns:wps="http://schemas.microsoft.com/office/word/2010/wordprocessingShape" mc:Ignorable="w14 w15 w16se w16cid w16 w16cex w16sdtdh wp14">
   <w:footnote w:type="separator" w:id="-1">
     <w:p>
       <w:r>
@@ -22598,7 +22577,7 @@
 </file>
 
 <file path=word/header1.xml><?xml version="1.0" encoding="utf-8"?>
-<w:hdr xmlns:wpc="http://schemas.microsoft.com/office/word/2010/wordprocessingCanvas" xmlns:cx="http://schemas.microsoft.com/office/drawing/2014/chartex" xmlns:cx1="http://schemas.microsoft.com/office/drawing/2015/9/8/chartex" xmlns:cx2="http://schemas.microsoft.com/office/drawing/2015/10/21/chartex" xmlns:cx3="http://schemas.microsoft.com/office/drawing/2016/5/9/chartex" xmlns:cx4="http://schemas.microsoft.com/office/drawing/2016/5/10/chartex" xmlns:cx5="http://schemas.microsoft.com/office/drawing/2016/5/11/chartex" xmlns:cx6="http://schemas.microsoft.com/office/drawing/2016/5/12/chartex" xmlns:cx7="http://schemas.microsoft.com/office/drawing/2016/5/13/chartex" xmlns:cx8="http://schemas.microsoft.com/office/drawing/2016/5/14/chartex" xmlns:mc="http://schemas.openxmlformats.org/markup-compatibility/2006" xmlns:aink="http://schemas.microsoft.com/office/drawing/2016/ink" xmlns:am3d="http://schemas.microsoft.com/office/drawing/2017/model3d" xmlns:o="urn:schemas-microsoft-com:office:office" xmlns:oel="http://schemas.microsoft.com/office/2019/extlst" xmlns:r="http://schemas.openxmlformats.org/officeDocument/2006/relationships" xmlns:m="http://schemas.openxmlformats.org/officeDocument/2006/math" xmlns:v="urn:schemas-microsoft-com:vml" xmlns:wp14="http://schemas.microsoft.com/office/word/2010/wordprocessingDrawing" xmlns:wp="http://schemas.openxmlformats.org/drawingml/2006/wordprocessingDrawing" xmlns:w10="urn:schemas-microsoft-com:office:word" xmlns:w="http://schemas.openxmlformats.org/wordprocessingml/2006/main" xmlns:w14="http://schemas.microsoft.com/office/word/2010/wordml" xmlns:w15="http://schemas.microsoft.com/office/word/2012/wordml" xmlns:w16cex="http://schemas.microsoft.com/office/word/2018/wordml/cex" xmlns:w16cid="http://schemas.microsoft.com/office/word/2016/wordml/cid" xmlns:w16="http://schemas.microsoft.com/office/word/2018/wordml" xmlns:w16du="http://schemas.microsoft.com/office/word/2023/wordml/word16du" xmlns:w16sdtdh="http://schemas.microsoft.com/office/word/2020/wordml/sdtdatahash" xmlns:w16sdtfl="http://schemas.microsoft.com/office/word/2024/wordml/sdtformatlock" xmlns:w16se="http://schemas.microsoft.com/office/word/2015/wordml/symex" xmlns:wpg="http://schemas.microsoft.com/office/word/2010/wordprocessingGroup" xmlns:wpi="http://schemas.microsoft.com/office/word/2010/wordprocessingInk" xmlns:wne="http://schemas.microsoft.com/office/word/2006/wordml" xmlns:wps="http://schemas.microsoft.com/office/word/2010/wordprocessingShape" mc:Ignorable="w14 w15 w16se w16cid w16 w16cex w16sdtdh w16sdtfl w16du wp14">
+<w:hdr xmlns:wpc="http://schemas.microsoft.com/office/word/2010/wordprocessingCanvas" xmlns:cx="http://schemas.microsoft.com/office/drawing/2014/chartex" xmlns:cx1="http://schemas.microsoft.com/office/drawing/2015/9/8/chartex" xmlns:cx2="http://schemas.microsoft.com/office/drawing/2015/10/21/chartex" xmlns:cx3="http://schemas.microsoft.com/office/drawing/2016/5/9/chartex" xmlns:cx4="http://schemas.microsoft.com/office/drawing/2016/5/10/chartex" xmlns:cx5="http://schemas.microsoft.com/office/drawing/2016/5/11/chartex" xmlns:cx6="http://schemas.microsoft.com/office/drawing/2016/5/12/chartex" xmlns:cx7="http://schemas.microsoft.com/office/drawing/2016/5/13/chartex" xmlns:cx8="http://schemas.microsoft.com/office/drawing/2016/5/14/chartex" xmlns:mc="http://schemas.openxmlformats.org/markup-compatibility/2006" xmlns:aink="http://schemas.microsoft.com/office/drawing/2016/ink" xmlns:am3d="http://schemas.microsoft.com/office/drawing/2017/model3d" xmlns:o="urn:schemas-microsoft-com:office:office" xmlns:oel="http://schemas.microsoft.com/office/2019/extlst" xmlns:r="http://schemas.openxmlformats.org/officeDocument/2006/relationships" xmlns:m="http://schemas.openxmlformats.org/officeDocument/2006/math" xmlns:v="urn:schemas-microsoft-com:vml" xmlns:wp14="http://schemas.microsoft.com/office/word/2010/wordprocessingDrawing" xmlns:wp="http://schemas.openxmlformats.org/drawingml/2006/wordprocessingDrawing" xmlns:w10="urn:schemas-microsoft-com:office:word" xmlns:w="http://schemas.openxmlformats.org/wordprocessingml/2006/main" xmlns:w14="http://schemas.microsoft.com/office/word/2010/wordml" xmlns:w15="http://schemas.microsoft.com/office/word/2012/wordml" xmlns:w16cex="http://schemas.microsoft.com/office/word/2018/wordml/cex" xmlns:w16cid="http://schemas.microsoft.com/office/word/2016/wordml/cid" xmlns:w16="http://schemas.microsoft.com/office/word/2018/wordml" xmlns:w16sdtdh="http://schemas.microsoft.com/office/word/2020/wordml/sdtdatahash" xmlns:w16se="http://schemas.microsoft.com/office/word/2015/wordml/symex" xmlns:wpg="http://schemas.microsoft.com/office/word/2010/wordprocessingGroup" xmlns:wpi="http://schemas.microsoft.com/office/word/2010/wordprocessingInk" xmlns:wne="http://schemas.microsoft.com/office/word/2006/wordml" xmlns:wps="http://schemas.microsoft.com/office/word/2010/wordprocessingShape" mc:Ignorable="w14 w15 w16se w16cid w16 w16cex w16sdtdh wp14">
   <w:sdt>
     <w:sdtPr>
       <w:id w:val="855009387"/>
@@ -22643,7 +22622,7 @@
 </file>
 
 <file path=word/numbering.xml><?xml version="1.0" encoding="utf-8"?>
-<w:numbering xmlns:wpc="http://schemas.microsoft.com/office/word/2010/wordprocessingCanvas" xmlns:cx="http://schemas.microsoft.com/office/drawing/2014/chartex" xmlns:cx1="http://schemas.microsoft.com/office/drawing/2015/9/8/chartex" xmlns:cx2="http://schemas.microsoft.com/office/drawing/2015/10/21/chartex" xmlns:cx3="http://schemas.microsoft.com/office/drawing/2016/5/9/chartex" xmlns:cx4="http://schemas.microsoft.com/office/drawing/2016/5/10/chartex" xmlns:cx5="http://schemas.microsoft.com/office/drawing/2016/5/11/chartex" xmlns:cx6="http://schemas.microsoft.com/office/drawing/2016/5/12/chartex" xmlns:cx7="http://schemas.microsoft.com/office/drawing/2016/5/13/chartex" xmlns:cx8="http://schemas.microsoft.com/office/drawing/2016/5/14/chartex" xmlns:mc="http://schemas.openxmlformats.org/markup-compatibility/2006" xmlns:aink="http://schemas.microsoft.com/office/drawing/2016/ink" xmlns:am3d="http://schemas.microsoft.com/office/drawing/2017/model3d" xmlns:o="urn:schemas-microsoft-com:office:office" xmlns:oel="http://schemas.microsoft.com/office/2019/extlst" xmlns:r="http://schemas.openxmlformats.org/officeDocument/2006/relationships" xmlns:m="http://schemas.openxmlformats.org/officeDocument/2006/math" xmlns:v="urn:schemas-microsoft-com:vml" xmlns:wp14="http://schemas.microsoft.com/office/word/2010/wordprocessingDrawing" xmlns:wp="http://schemas.openxmlformats.org/drawingml/2006/wordprocessingDrawing" xmlns:w10="urn:schemas-microsoft-com:office:word" xmlns:w="http://schemas.openxmlformats.org/wordprocessingml/2006/main" xmlns:w14="http://schemas.microsoft.com/office/word/2010/wordml" xmlns:w15="http://schemas.microsoft.com/office/word/2012/wordml" xmlns:w16cex="http://schemas.microsoft.com/office/word/2018/wordml/cex" xmlns:w16cid="http://schemas.microsoft.com/office/word/2016/wordml/cid" xmlns:w16="http://schemas.microsoft.com/office/word/2018/wordml" xmlns:w16du="http://schemas.microsoft.com/office/word/2023/wordml/word16du" xmlns:w16sdtdh="http://schemas.microsoft.com/office/word/2020/wordml/sdtdatahash" xmlns:w16sdtfl="http://schemas.microsoft.com/office/word/2024/wordml/sdtformatlock" xmlns:w16se="http://schemas.microsoft.com/office/word/2015/wordml/symex" xmlns:wpg="http://schemas.microsoft.com/office/word/2010/wordprocessingGroup" xmlns:wpi="http://schemas.microsoft.com/office/word/2010/wordprocessingInk" xmlns:wne="http://schemas.microsoft.com/office/word/2006/wordml" xmlns:wps="http://schemas.microsoft.com/office/word/2010/wordprocessingShape" mc:Ignorable="w14 w15 w16se w16cid w16 w16cex w16sdtdh w16sdtfl w16du wp14">
+<w:numbering xmlns:wpc="http://schemas.microsoft.com/office/word/2010/wordprocessingCanvas" xmlns:cx="http://schemas.microsoft.com/office/drawing/2014/chartex" xmlns:cx1="http://schemas.microsoft.com/office/drawing/2015/9/8/chartex" xmlns:cx2="http://schemas.microsoft.com/office/drawing/2015/10/21/chartex" xmlns:cx3="http://schemas.microsoft.com/office/drawing/2016/5/9/chartex" xmlns:cx4="http://schemas.microsoft.com/office/drawing/2016/5/10/chartex" xmlns:cx5="http://schemas.microsoft.com/office/drawing/2016/5/11/chartex" xmlns:cx6="http://schemas.microsoft.com/office/drawing/2016/5/12/chartex" xmlns:cx7="http://schemas.microsoft.com/office/drawing/2016/5/13/chartex" xmlns:cx8="http://schemas.microsoft.com/office/drawing/2016/5/14/chartex" xmlns:mc="http://schemas.openxmlformats.org/markup-compatibility/2006" xmlns:aink="http://schemas.microsoft.com/office/drawing/2016/ink" xmlns:am3d="http://schemas.microsoft.com/office/drawing/2017/model3d" xmlns:o="urn:schemas-microsoft-com:office:office" xmlns:oel="http://schemas.microsoft.com/office/2019/extlst" xmlns:r="http://schemas.openxmlformats.org/officeDocument/2006/relationships" xmlns:m="http://schemas.openxmlformats.org/officeDocument/2006/math" xmlns:v="urn:schemas-microsoft-com:vml" xmlns:wp14="http://schemas.microsoft.com/office/word/2010/wordprocessingDrawing" xmlns:wp="http://schemas.openxmlformats.org/drawingml/2006/wordprocessingDrawing" xmlns:w10="urn:schemas-microsoft-com:office:word" xmlns:w="http://schemas.openxmlformats.org/wordprocessingml/2006/main" xmlns:w14="http://schemas.microsoft.com/office/word/2010/wordml" xmlns:w15="http://schemas.microsoft.com/office/word/2012/wordml" xmlns:w16cex="http://schemas.microsoft.com/office/word/2018/wordml/cex" xmlns:w16cid="http://schemas.microsoft.com/office/word/2016/wordml/cid" xmlns:w16="http://schemas.microsoft.com/office/word/2018/wordml" xmlns:w16sdtdh="http://schemas.microsoft.com/office/word/2020/wordml/sdtdatahash" xmlns:w16se="http://schemas.microsoft.com/office/word/2015/wordml/symex" xmlns:wpg="http://schemas.microsoft.com/office/word/2010/wordprocessingGroup" xmlns:wpi="http://schemas.microsoft.com/office/word/2010/wordprocessingInk" xmlns:wne="http://schemas.microsoft.com/office/word/2006/wordml" xmlns:wps="http://schemas.microsoft.com/office/word/2010/wordprocessingShape" mc:Ignorable="w14 w15 w16se w16cid w16 w16cex w16sdtdh wp14">
   <w:abstractNum w:abstractNumId="0" w15:restartNumberingAfterBreak="0">
     <w:nsid w:val="04317FF2"/>
     <w:multiLevelType w:val="hybridMultilevel"/>
@@ -22800,7 +22779,7 @@
 </file>
 
 <file path=word/styles.xml><?xml version="1.0" encoding="utf-8"?>
-<w:styles xmlns:mc="http://schemas.openxmlformats.org/markup-compatibility/2006" xmlns:r="http://schemas.openxmlformats.org/officeDocument/2006/relationships" xmlns:w="http://schemas.openxmlformats.org/wordprocessingml/2006/main" xmlns:w14="http://schemas.microsoft.com/office/word/2010/wordml" xmlns:w15="http://schemas.microsoft.com/office/word/2012/wordml" xmlns:w16cex="http://schemas.microsoft.com/office/word/2018/wordml/cex" xmlns:w16cid="http://schemas.microsoft.com/office/word/2016/wordml/cid" xmlns:w16="http://schemas.microsoft.com/office/word/2018/wordml" xmlns:w16du="http://schemas.microsoft.com/office/word/2023/wordml/word16du" xmlns:w16sdtdh="http://schemas.microsoft.com/office/word/2020/wordml/sdtdatahash" xmlns:w16sdtfl="http://schemas.microsoft.com/office/word/2024/wordml/sdtformatlock" xmlns:w16se="http://schemas.microsoft.com/office/word/2015/wordml/symex" mc:Ignorable="w14 w15 w16se w16cid w16 w16cex w16sdtdh w16sdtfl w16du">
+<w:styles xmlns:mc="http://schemas.openxmlformats.org/markup-compatibility/2006" xmlns:r="http://schemas.openxmlformats.org/officeDocument/2006/relationships" xmlns:w="http://schemas.openxmlformats.org/wordprocessingml/2006/main" xmlns:w14="http://schemas.microsoft.com/office/word/2010/wordml" xmlns:w15="http://schemas.microsoft.com/office/word/2012/wordml" xmlns:w16cex="http://schemas.microsoft.com/office/word/2018/wordml/cex" xmlns:w16cid="http://schemas.microsoft.com/office/word/2016/wordml/cid" xmlns:w16="http://schemas.microsoft.com/office/word/2018/wordml" xmlns:w16sdtdh="http://schemas.microsoft.com/office/word/2020/wordml/sdtdatahash" xmlns:w16se="http://schemas.microsoft.com/office/word/2015/wordml/symex" mc:Ignorable="w14 w15 w16se w16cid w16 w16cex w16sdtdh">
   <w:docDefaults>
     <w:rPrDefault>
       <w:rPr>

</xml_diff>